<commit_message>
fix: make Total Tax Cost an inner disc bullet and scope disc numbering per document
</commit_message>
<xml_diff>
--- a/Aptech-Limited-Weekly-Status-Report_20260914_to_20260920.docx
+++ b/Aptech-Limited-Weekly-Status-Report_20260914_to_20260920.docx
@@ -4487,15 +4487,27 @@
     <w:p>
       <w:pPr>
         <w:spacing w:before="0" w:after="40" w:line="240" w:lineRule="auto"/>
+        <w:ind w:left="1354" w:hanging="360"/>
+        <w:numPr>
+          <w:ilvl w:val="1"/>
+          <w:numId w:val="9101"/>
+        </w:numPr>
       </w:pPr>
       <w:r>
         <w:rPr>
           <w:rFonts w:ascii="Arial" w:hAnsi="Arial"/>
           <w:b w:val="0"/>
-          <w:i w:val="0"/>
           <w:sz w:val="24"/>
         </w:rPr>
-        <w:t>Total Tax Cost: $26.49</w:t>
+        <w:t xml:space="preserve">Total Tax Cost: </w:t>
+      </w:r>
+      <w:r>
+        <w:rPr>
+          <w:rFonts w:ascii="Arial" w:hAnsi="Arial"/>
+          <w:b/>
+          <w:sz w:val="24"/>
+        </w:rPr>
+        <w:t>$26.49</w:t>
       </w:r>
     </w:p>
     <w:p>
@@ -6010,15 +6022,27 @@
     <w:p>
       <w:pPr>
         <w:spacing w:before="0" w:after="40" w:line="240" w:lineRule="auto"/>
+        <w:ind w:left="1354" w:hanging="360"/>
+        <w:numPr>
+          <w:ilvl w:val="1"/>
+          <w:numId w:val="9101"/>
+        </w:numPr>
       </w:pPr>
       <w:r>
         <w:rPr>
           <w:rFonts w:ascii="Arial" w:hAnsi="Arial"/>
           <w:b w:val="0"/>
-          <w:i w:val="0"/>
           <w:sz w:val="24"/>
         </w:rPr>
-        <w:t>Total Tax Cost: $21.86</w:t>
+        <w:t xml:space="preserve">Total Tax Cost: </w:t>
+      </w:r>
+      <w:r>
+        <w:rPr>
+          <w:rFonts w:ascii="Arial" w:hAnsi="Arial"/>
+          <w:b/>
+          <w:sz w:val="24"/>
+        </w:rPr>
+        <w:t>$21.86</w:t>
       </w:r>
     </w:p>
     <w:p>
@@ -6878,15 +6902,27 @@
     <w:p>
       <w:pPr>
         <w:spacing w:before="0" w:after="40" w:line="240" w:lineRule="auto"/>
+        <w:ind w:left="1354" w:hanging="360"/>
+        <w:numPr>
+          <w:ilvl w:val="1"/>
+          <w:numId w:val="9101"/>
+        </w:numPr>
       </w:pPr>
       <w:r>
         <w:rPr>
           <w:rFonts w:ascii="Arial" w:hAnsi="Arial"/>
           <w:b w:val="0"/>
-          <w:i w:val="0"/>
           <w:sz w:val="24"/>
         </w:rPr>
-        <w:t>Total Tax Cost: $22.64</w:t>
+        <w:t xml:space="preserve">Total Tax Cost: </w:t>
+      </w:r>
+      <w:r>
+        <w:rPr>
+          <w:rFonts w:ascii="Arial" w:hAnsi="Arial"/>
+          <w:b/>
+          <w:sz w:val="24"/>
+        </w:rPr>
+        <w:t>$22.64</w:t>
       </w:r>
     </w:p>
     <w:p>
@@ -7953,15 +7989,27 @@
     <w:p>
       <w:pPr>
         <w:spacing w:before="0" w:after="40" w:line="240" w:lineRule="auto"/>
+        <w:ind w:left="1354" w:hanging="360"/>
+        <w:numPr>
+          <w:ilvl w:val="1"/>
+          <w:numId w:val="9101"/>
+        </w:numPr>
       </w:pPr>
       <w:r>
         <w:rPr>
           <w:rFonts w:ascii="Arial" w:hAnsi="Arial"/>
           <w:b w:val="0"/>
-          <w:i w:val="0"/>
           <w:sz w:val="24"/>
         </w:rPr>
-        <w:t>Total Tax Cost: $15.86</w:t>
+        <w:t xml:space="preserve">Total Tax Cost: </w:t>
+      </w:r>
+      <w:r>
+        <w:rPr>
+          <w:rFonts w:ascii="Arial" w:hAnsi="Arial"/>
+          <w:b/>
+          <w:sz w:val="24"/>
+        </w:rPr>
+        <w:t>$15.86</w:t>
       </w:r>
     </w:p>
     <w:p>
@@ -9509,15 +9557,27 @@
     <w:p>
       <w:pPr>
         <w:spacing w:before="0" w:after="40" w:line="240" w:lineRule="auto"/>
+        <w:ind w:left="1354" w:hanging="360"/>
+        <w:numPr>
+          <w:ilvl w:val="1"/>
+          <w:numId w:val="9101"/>
+        </w:numPr>
       </w:pPr>
       <w:r>
         <w:rPr>
           <w:rFonts w:ascii="Arial" w:hAnsi="Arial"/>
           <w:b w:val="0"/>
-          <w:i w:val="0"/>
           <w:sz w:val="24"/>
         </w:rPr>
-        <w:t>Total Tax Cost: $5.19</w:t>
+        <w:t xml:space="preserve">Total Tax Cost: </w:t>
+      </w:r>
+      <w:r>
+        <w:rPr>
+          <w:rFonts w:ascii="Arial" w:hAnsi="Arial"/>
+          <w:b/>
+          <w:sz w:val="24"/>
+        </w:rPr>
+        <w:t>$5.19</w:t>
       </w:r>
     </w:p>
     <w:p>
@@ -11687,15 +11747,27 @@
     <w:p>
       <w:pPr>
         <w:spacing w:before="0" w:after="40" w:line="240" w:lineRule="auto"/>
+        <w:ind w:left="1354" w:hanging="360"/>
+        <w:numPr>
+          <w:ilvl w:val="1"/>
+          <w:numId w:val="9101"/>
+        </w:numPr>
       </w:pPr>
       <w:r>
         <w:rPr>
           <w:rFonts w:ascii="Arial" w:hAnsi="Arial"/>
           <w:b w:val="0"/>
-          <w:i w:val="0"/>
           <w:sz w:val="24"/>
         </w:rPr>
-        <w:t>Total Tax Cost: $3.15</w:t>
+        <w:t xml:space="preserve">Total Tax Cost: </w:t>
+      </w:r>
+      <w:r>
+        <w:rPr>
+          <w:rFonts w:ascii="Arial" w:hAnsi="Arial"/>
+          <w:b/>
+          <w:sz w:val="24"/>
+        </w:rPr>
+        <w:t>$3.15</w:t>
       </w:r>
     </w:p>
     <w:p>
@@ -12190,15 +12262,27 @@
     <w:p>
       <w:pPr>
         <w:spacing w:before="0" w:after="40" w:line="240" w:lineRule="auto"/>
+        <w:ind w:left="1354" w:hanging="360"/>
+        <w:numPr>
+          <w:ilvl w:val="1"/>
+          <w:numId w:val="9101"/>
+        </w:numPr>
       </w:pPr>
       <w:r>
         <w:rPr>
           <w:rFonts w:ascii="Arial" w:hAnsi="Arial"/>
           <w:b w:val="0"/>
-          <w:i w:val="0"/>
           <w:sz w:val="24"/>
         </w:rPr>
-        <w:t>Total Tax Cost: $11.60</w:t>
+        <w:t xml:space="preserve">Total Tax Cost: </w:t>
+      </w:r>
+      <w:r>
+        <w:rPr>
+          <w:rFonts w:ascii="Arial" w:hAnsi="Arial"/>
+          <w:b/>
+          <w:sz w:val="24"/>
+        </w:rPr>
+        <w:t>$11.60</w:t>
       </w:r>
     </w:p>
     <w:p>
@@ -12486,15 +12570,27 @@
     <w:p>
       <w:pPr>
         <w:spacing w:before="0" w:after="40" w:line="240" w:lineRule="auto"/>
+        <w:ind w:left="1354" w:hanging="360"/>
+        <w:numPr>
+          <w:ilvl w:val="1"/>
+          <w:numId w:val="9101"/>
+        </w:numPr>
       </w:pPr>
       <w:r>
         <w:rPr>
           <w:rFonts w:ascii="Arial" w:hAnsi="Arial"/>
           <w:b w:val="0"/>
-          <w:i w:val="0"/>
           <w:sz w:val="24"/>
         </w:rPr>
-        <w:t>Total Tax Cost: $4.25</w:t>
+        <w:t xml:space="preserve">Total Tax Cost: </w:t>
+      </w:r>
+      <w:r>
+        <w:rPr>
+          <w:rFonts w:ascii="Arial" w:hAnsi="Arial"/>
+          <w:b/>
+          <w:sz w:val="24"/>
+        </w:rPr>
+        <w:t>$4.25</w:t>
       </w:r>
     </w:p>
     <w:p>
@@ -13155,15 +13251,27 @@
     <w:p>
       <w:pPr>
         <w:spacing w:before="0" w:after="40" w:line="240" w:lineRule="auto"/>
+        <w:ind w:left="1354" w:hanging="360"/>
+        <w:numPr>
+          <w:ilvl w:val="1"/>
+          <w:numId w:val="9101"/>
+        </w:numPr>
       </w:pPr>
       <w:r>
         <w:rPr>
           <w:rFonts w:ascii="Arial" w:hAnsi="Arial"/>
           <w:b w:val="0"/>
-          <w:i w:val="0"/>
           <w:sz w:val="24"/>
         </w:rPr>
-        <w:t>Total Tax Cost: $5.36</w:t>
+        <w:t xml:space="preserve">Total Tax Cost: </w:t>
+      </w:r>
+      <w:r>
+        <w:rPr>
+          <w:rFonts w:ascii="Arial" w:hAnsi="Arial"/>
+          <w:b/>
+          <w:sz w:val="24"/>
+        </w:rPr>
+        <w:t>$5.36</w:t>
       </w:r>
     </w:p>
     <w:p>

</xml_diff>